<commit_message>
feat: enhance web applications with comparative analysis of Go and Kotlin implementations for various calculators
</commit_message>
<xml_diff>
--- a/PW01ТВ-21_LAS/PW01ТВ-21_ЛазарчукАртемСергійович.docx
+++ b/PW01ТВ-21_LAS/PW01ТВ-21_ЛазарчукАртемСергійович.docx
@@ -671,6 +671,7 @@
       <w:r>
         <w:rPr>
           <w:rFonts w:ascii="Times New Roman" w:eastAsia="Times New Roman" w:hAnsi="Times New Roman" w:cs="Times New Roman"/>
+          <w:noProof/>
           <w:color w:val="000000"/>
           <w:sz w:val="30"/>
           <w:szCs w:val="30"/>
@@ -4050,6 +4051,7 @@
       <w:r>
         <w:rPr>
           <w:rFonts w:ascii="Times New Roman" w:eastAsia="Times New Roman" w:hAnsi="Times New Roman" w:cs="Times New Roman"/>
+          <w:noProof/>
           <w:color w:val="000000"/>
           <w:sz w:val="28"/>
           <w:szCs w:val="28"/>
@@ -12706,8 +12708,6 @@
           <w:szCs w:val="28"/>
         </w:rPr>
       </w:pPr>
-      <w:bookmarkStart w:id="1" w:name="_GoBack"/>
-      <w:bookmarkEnd w:id="1"/>
       <w:r>
         <w:rPr>
           <w:rFonts w:ascii="Times New Roman" w:eastAsia="Times New Roman" w:hAnsi="Times New Roman" w:cs="Times New Roman"/>
@@ -12948,13 +12948,425 @@
     <w:p>
       <w:pPr>
         <w:spacing w:after="0"/>
-        <w:rPr>
-          <w:rFonts w:ascii="Times New Roman" w:eastAsia="Times New Roman" w:hAnsi="Times New Roman" w:cs="Times New Roman"/>
-          <w:color w:val="000000"/>
-          <w:sz w:val="28"/>
-          <w:szCs w:val="28"/>
-        </w:rPr>
-      </w:pPr>
+        <w:jc w:val="both"/>
+        <w:rPr>
+          <w:rFonts w:ascii="Times New Roman" w:eastAsia="Times New Roman" w:hAnsi="Times New Roman" w:cs="Times New Roman"/>
+          <w:color w:val="000000"/>
+          <w:sz w:val="28"/>
+          <w:szCs w:val="28"/>
+        </w:rPr>
+      </w:pPr>
+      <w:r>
+        <w:rPr>
+          <w:rFonts w:ascii="Times New Roman" w:eastAsia="Times New Roman" w:hAnsi="Times New Roman" w:cs="Times New Roman"/>
+          <w:color w:val="000000"/>
+          <w:sz w:val="28"/>
+          <w:szCs w:val="28"/>
+        </w:rPr>
+        <w:t xml:space="preserve">Порівняно з оригінальною реалізацією на </w:t>
+      </w:r>
+      <w:proofErr w:type="spellStart"/>
+      <w:r>
+        <w:rPr>
+          <w:rFonts w:ascii="Times New Roman" w:eastAsia="Times New Roman" w:hAnsi="Times New Roman" w:cs="Times New Roman"/>
+          <w:color w:val="000000"/>
+          <w:sz w:val="28"/>
+          <w:szCs w:val="28"/>
+        </w:rPr>
+        <w:t>Kotlin</w:t>
+      </w:r>
+      <w:proofErr w:type="spellEnd"/>
+      <w:r>
+        <w:rPr>
+          <w:rFonts w:ascii="Times New Roman" w:eastAsia="Times New Roman" w:hAnsi="Times New Roman" w:cs="Times New Roman"/>
+          <w:color w:val="000000"/>
+          <w:sz w:val="28"/>
+          <w:szCs w:val="28"/>
+        </w:rPr>
+        <w:t xml:space="preserve"> з </w:t>
+      </w:r>
+      <w:proofErr w:type="spellStart"/>
+      <w:r>
+        <w:rPr>
+          <w:rFonts w:ascii="Times New Roman" w:eastAsia="Times New Roman" w:hAnsi="Times New Roman" w:cs="Times New Roman"/>
+          <w:color w:val="000000"/>
+          <w:sz w:val="28"/>
+          <w:szCs w:val="28"/>
+        </w:rPr>
+        <w:t>Jetpack</w:t>
+      </w:r>
+      <w:proofErr w:type="spellEnd"/>
+      <w:r>
+        <w:rPr>
+          <w:rFonts w:ascii="Times New Roman" w:eastAsia="Times New Roman" w:hAnsi="Times New Roman" w:cs="Times New Roman"/>
+          <w:color w:val="000000"/>
+          <w:sz w:val="28"/>
+          <w:szCs w:val="28"/>
+        </w:rPr>
+        <w:t xml:space="preserve"> </w:t>
+      </w:r>
+      <w:proofErr w:type="spellStart"/>
+      <w:r>
+        <w:rPr>
+          <w:rFonts w:ascii="Times New Roman" w:eastAsia="Times New Roman" w:hAnsi="Times New Roman" w:cs="Times New Roman"/>
+          <w:color w:val="000000"/>
+          <w:sz w:val="28"/>
+          <w:szCs w:val="28"/>
+        </w:rPr>
+        <w:t>Compose</w:t>
+      </w:r>
+      <w:proofErr w:type="spellEnd"/>
+      <w:r>
+        <w:rPr>
+          <w:rFonts w:ascii="Times New Roman" w:eastAsia="Times New Roman" w:hAnsi="Times New Roman" w:cs="Times New Roman"/>
+          <w:color w:val="000000"/>
+          <w:sz w:val="28"/>
+          <w:szCs w:val="28"/>
+        </w:rPr>
+        <w:t xml:space="preserve"> для </w:t>
+      </w:r>
+      <w:proofErr w:type="spellStart"/>
+      <w:r>
+        <w:rPr>
+          <w:rFonts w:ascii="Times New Roman" w:eastAsia="Times New Roman" w:hAnsi="Times New Roman" w:cs="Times New Roman"/>
+          <w:color w:val="000000"/>
+          <w:sz w:val="28"/>
+          <w:szCs w:val="28"/>
+        </w:rPr>
+        <w:t>Android</w:t>
+      </w:r>
+      <w:proofErr w:type="spellEnd"/>
+      <w:r>
+        <w:rPr>
+          <w:rFonts w:ascii="Times New Roman" w:eastAsia="Times New Roman" w:hAnsi="Times New Roman" w:cs="Times New Roman"/>
+          <w:color w:val="000000"/>
+          <w:sz w:val="28"/>
+          <w:szCs w:val="28"/>
+        </w:rPr>
+        <w:t xml:space="preserve">, версія на </w:t>
+      </w:r>
+      <w:proofErr w:type="spellStart"/>
+      <w:r>
+        <w:rPr>
+          <w:rFonts w:ascii="Times New Roman" w:eastAsia="Times New Roman" w:hAnsi="Times New Roman" w:cs="Times New Roman"/>
+          <w:color w:val="000000"/>
+          <w:sz w:val="28"/>
+          <w:szCs w:val="28"/>
+        </w:rPr>
+        <w:t>Go</w:t>
+      </w:r>
+      <w:proofErr w:type="spellEnd"/>
+      <w:r>
+        <w:rPr>
+          <w:rFonts w:ascii="Times New Roman" w:eastAsia="Times New Roman" w:hAnsi="Times New Roman" w:cs="Times New Roman"/>
+          <w:color w:val="000000"/>
+          <w:sz w:val="28"/>
+          <w:szCs w:val="28"/>
+        </w:rPr>
+        <w:t xml:space="preserve"> має низку відмінностей. </w:t>
+      </w:r>
+      <w:proofErr w:type="spellStart"/>
+      <w:r>
+        <w:rPr>
+          <w:rFonts w:ascii="Times New Roman" w:eastAsia="Times New Roman" w:hAnsi="Times New Roman" w:cs="Times New Roman"/>
+          <w:color w:val="000000"/>
+          <w:sz w:val="28"/>
+          <w:szCs w:val="28"/>
+        </w:rPr>
+        <w:t>Kotlin</w:t>
+      </w:r>
+      <w:proofErr w:type="spellEnd"/>
+      <w:r>
+        <w:rPr>
+          <w:rFonts w:ascii="Times New Roman" w:eastAsia="Times New Roman" w:hAnsi="Times New Roman" w:cs="Times New Roman"/>
+          <w:color w:val="000000"/>
+          <w:sz w:val="28"/>
+          <w:szCs w:val="28"/>
+        </w:rPr>
+        <w:t xml:space="preserve">-версія працює як мобільний застосунок з </w:t>
+      </w:r>
+      <w:proofErr w:type="spellStart"/>
+      <w:r>
+        <w:rPr>
+          <w:rFonts w:ascii="Times New Roman" w:eastAsia="Times New Roman" w:hAnsi="Times New Roman" w:cs="Times New Roman"/>
+          <w:color w:val="000000"/>
+          <w:sz w:val="28"/>
+          <w:szCs w:val="28"/>
+        </w:rPr>
+        <w:t>нативним</w:t>
+      </w:r>
+      <w:proofErr w:type="spellEnd"/>
+      <w:r>
+        <w:rPr>
+          <w:rFonts w:ascii="Times New Roman" w:eastAsia="Times New Roman" w:hAnsi="Times New Roman" w:cs="Times New Roman"/>
+          <w:color w:val="000000"/>
+          <w:sz w:val="28"/>
+          <w:szCs w:val="28"/>
+        </w:rPr>
+        <w:t xml:space="preserve"> інтерфейсом </w:t>
+      </w:r>
+      <w:proofErr w:type="spellStart"/>
+      <w:r>
+        <w:rPr>
+          <w:rFonts w:ascii="Times New Roman" w:eastAsia="Times New Roman" w:hAnsi="Times New Roman" w:cs="Times New Roman"/>
+          <w:color w:val="000000"/>
+          <w:sz w:val="28"/>
+          <w:szCs w:val="28"/>
+        </w:rPr>
+        <w:t>Material</w:t>
+      </w:r>
+      <w:proofErr w:type="spellEnd"/>
+      <w:r>
+        <w:rPr>
+          <w:rFonts w:ascii="Times New Roman" w:eastAsia="Times New Roman" w:hAnsi="Times New Roman" w:cs="Times New Roman"/>
+          <w:color w:val="000000"/>
+          <w:sz w:val="28"/>
+          <w:szCs w:val="28"/>
+        </w:rPr>
+        <w:t xml:space="preserve"> </w:t>
+      </w:r>
+      <w:proofErr w:type="spellStart"/>
+      <w:r>
+        <w:rPr>
+          <w:rFonts w:ascii="Times New Roman" w:eastAsia="Times New Roman" w:hAnsi="Times New Roman" w:cs="Times New Roman"/>
+          <w:color w:val="000000"/>
+          <w:sz w:val="28"/>
+          <w:szCs w:val="28"/>
+        </w:rPr>
+        <w:t>Design</w:t>
+      </w:r>
+      <w:proofErr w:type="spellEnd"/>
+      <w:r>
+        <w:rPr>
+          <w:rFonts w:ascii="Times New Roman" w:eastAsia="Times New Roman" w:hAnsi="Times New Roman" w:cs="Times New Roman"/>
+          <w:color w:val="000000"/>
+          <w:sz w:val="28"/>
+          <w:szCs w:val="28"/>
+        </w:rPr>
+        <w:t xml:space="preserve">, тоді як </w:t>
+      </w:r>
+      <w:proofErr w:type="spellStart"/>
+      <w:r>
+        <w:rPr>
+          <w:rFonts w:ascii="Times New Roman" w:eastAsia="Times New Roman" w:hAnsi="Times New Roman" w:cs="Times New Roman"/>
+          <w:color w:val="000000"/>
+          <w:sz w:val="28"/>
+          <w:szCs w:val="28"/>
+        </w:rPr>
+        <w:t>Go</w:t>
+      </w:r>
+      <w:proofErr w:type="spellEnd"/>
+      <w:r>
+        <w:rPr>
+          <w:rFonts w:ascii="Times New Roman" w:eastAsia="Times New Roman" w:hAnsi="Times New Roman" w:cs="Times New Roman"/>
+          <w:color w:val="000000"/>
+          <w:sz w:val="28"/>
+          <w:szCs w:val="28"/>
+        </w:rPr>
+        <w:t xml:space="preserve">-версія використовує веб-інтерфейс на основі HTML-форм і доступна в будь-якому браузері на різних платформах. </w:t>
+      </w:r>
+      <w:proofErr w:type="spellStart"/>
+      <w:r>
+        <w:rPr>
+          <w:rFonts w:ascii="Times New Roman" w:eastAsia="Times New Roman" w:hAnsi="Times New Roman" w:cs="Times New Roman"/>
+          <w:color w:val="000000"/>
+          <w:sz w:val="28"/>
+          <w:szCs w:val="28"/>
+        </w:rPr>
+        <w:t>Kotlin</w:t>
+      </w:r>
+      <w:proofErr w:type="spellEnd"/>
+      <w:r>
+        <w:rPr>
+          <w:rFonts w:ascii="Times New Roman" w:eastAsia="Times New Roman" w:hAnsi="Times New Roman" w:cs="Times New Roman"/>
+          <w:color w:val="000000"/>
+          <w:sz w:val="28"/>
+          <w:szCs w:val="28"/>
+        </w:rPr>
+        <w:t xml:space="preserve">-застосунок потребує встановлення на пристрій і залежить від </w:t>
+      </w:r>
+      <w:proofErr w:type="spellStart"/>
+      <w:r>
+        <w:rPr>
+          <w:rFonts w:ascii="Times New Roman" w:eastAsia="Times New Roman" w:hAnsi="Times New Roman" w:cs="Times New Roman"/>
+          <w:color w:val="000000"/>
+          <w:sz w:val="28"/>
+          <w:szCs w:val="28"/>
+        </w:rPr>
+        <w:t>Android</w:t>
+      </w:r>
+      <w:proofErr w:type="spellEnd"/>
+      <w:r>
+        <w:rPr>
+          <w:rFonts w:ascii="Times New Roman" w:eastAsia="Times New Roman" w:hAnsi="Times New Roman" w:cs="Times New Roman"/>
+          <w:color w:val="000000"/>
+          <w:sz w:val="28"/>
+          <w:szCs w:val="28"/>
+        </w:rPr>
+        <w:t xml:space="preserve"> SDK, а </w:t>
+      </w:r>
+      <w:proofErr w:type="spellStart"/>
+      <w:r>
+        <w:rPr>
+          <w:rFonts w:ascii="Times New Roman" w:eastAsia="Times New Roman" w:hAnsi="Times New Roman" w:cs="Times New Roman"/>
+          <w:color w:val="000000"/>
+          <w:sz w:val="28"/>
+          <w:szCs w:val="28"/>
+        </w:rPr>
+        <w:t>Go</w:t>
+      </w:r>
+      <w:proofErr w:type="spellEnd"/>
+      <w:r>
+        <w:rPr>
+          <w:rFonts w:ascii="Times New Roman" w:eastAsia="Times New Roman" w:hAnsi="Times New Roman" w:cs="Times New Roman"/>
+          <w:color w:val="000000"/>
+          <w:sz w:val="28"/>
+          <w:szCs w:val="28"/>
+        </w:rPr>
+        <w:t xml:space="preserve">-програма запускається як HTTP-сервер і не потребує додаткових </w:t>
+      </w:r>
+      <w:proofErr w:type="spellStart"/>
+      <w:r>
+        <w:rPr>
+          <w:rFonts w:ascii="Times New Roman" w:eastAsia="Times New Roman" w:hAnsi="Times New Roman" w:cs="Times New Roman"/>
+          <w:color w:val="000000"/>
+          <w:sz w:val="28"/>
+          <w:szCs w:val="28"/>
+        </w:rPr>
+        <w:t>залежностей</w:t>
+      </w:r>
+      <w:proofErr w:type="spellEnd"/>
+      <w:r>
+        <w:rPr>
+          <w:rFonts w:ascii="Times New Roman" w:eastAsia="Times New Roman" w:hAnsi="Times New Roman" w:cs="Times New Roman"/>
+          <w:color w:val="000000"/>
+          <w:sz w:val="28"/>
+          <w:szCs w:val="28"/>
+        </w:rPr>
+        <w:t>, крім стандартної бібліотеки. Розмір бінарного файлу </w:t>
+      </w:r>
+      <w:proofErr w:type="spellStart"/>
+      <w:r>
+        <w:rPr>
+          <w:rFonts w:ascii="Times New Roman" w:eastAsia="Times New Roman" w:hAnsi="Times New Roman" w:cs="Times New Roman"/>
+          <w:color w:val="000000"/>
+          <w:sz w:val="28"/>
+          <w:szCs w:val="28"/>
+        </w:rPr>
+        <w:t>Go</w:t>
+      </w:r>
+      <w:proofErr w:type="spellEnd"/>
+      <w:r>
+        <w:rPr>
+          <w:rFonts w:ascii="Times New Roman" w:eastAsia="Times New Roman" w:hAnsi="Times New Roman" w:cs="Times New Roman"/>
+          <w:color w:val="000000"/>
+          <w:sz w:val="28"/>
+          <w:szCs w:val="28"/>
+        </w:rPr>
+        <w:t xml:space="preserve"> становить кілька мегабайт, тоді як APK для </w:t>
+      </w:r>
+      <w:proofErr w:type="spellStart"/>
+      <w:r>
+        <w:rPr>
+          <w:rFonts w:ascii="Times New Roman" w:eastAsia="Times New Roman" w:hAnsi="Times New Roman" w:cs="Times New Roman"/>
+          <w:color w:val="000000"/>
+          <w:sz w:val="28"/>
+          <w:szCs w:val="28"/>
+        </w:rPr>
+        <w:t>Android</w:t>
+      </w:r>
+      <w:proofErr w:type="spellEnd"/>
+      <w:r>
+        <w:rPr>
+          <w:rFonts w:ascii="Times New Roman" w:eastAsia="Times New Roman" w:hAnsi="Times New Roman" w:cs="Times New Roman"/>
+          <w:color w:val="000000"/>
+          <w:sz w:val="28"/>
+          <w:szCs w:val="28"/>
+        </w:rPr>
+        <w:t xml:space="preserve"> зазвичай має десятки мегабайт. Обидві реалізації використовують однакові формули та логіку розрахунків, перевіряють введені дані та зберігають значення після обчислення. </w:t>
+      </w:r>
+      <w:proofErr w:type="spellStart"/>
+      <w:r>
+        <w:rPr>
+          <w:rFonts w:ascii="Times New Roman" w:eastAsia="Times New Roman" w:hAnsi="Times New Roman" w:cs="Times New Roman"/>
+          <w:color w:val="000000"/>
+          <w:sz w:val="28"/>
+          <w:szCs w:val="28"/>
+        </w:rPr>
+        <w:t>Kotlin</w:t>
+      </w:r>
+      <w:proofErr w:type="spellEnd"/>
+      <w:r>
+        <w:rPr>
+          <w:rFonts w:ascii="Times New Roman" w:eastAsia="Times New Roman" w:hAnsi="Times New Roman" w:cs="Times New Roman"/>
+          <w:color w:val="000000"/>
+          <w:sz w:val="28"/>
+          <w:szCs w:val="28"/>
+        </w:rPr>
+        <w:t xml:space="preserve"> дає змогу створювати складніший інтерфейс з анімаціями та </w:t>
+      </w:r>
+      <w:proofErr w:type="spellStart"/>
+      <w:r>
+        <w:rPr>
+          <w:rFonts w:ascii="Times New Roman" w:eastAsia="Times New Roman" w:hAnsi="Times New Roman" w:cs="Times New Roman"/>
+          <w:color w:val="000000"/>
+          <w:sz w:val="28"/>
+          <w:szCs w:val="28"/>
+        </w:rPr>
+        <w:t>Material</w:t>
+      </w:r>
+      <w:proofErr w:type="spellEnd"/>
+      <w:r>
+        <w:rPr>
+          <w:rFonts w:ascii="Times New Roman" w:eastAsia="Times New Roman" w:hAnsi="Times New Roman" w:cs="Times New Roman"/>
+          <w:color w:val="000000"/>
+          <w:sz w:val="28"/>
+          <w:szCs w:val="28"/>
+        </w:rPr>
+        <w:t xml:space="preserve"> 3, але обмежується платформою </w:t>
+      </w:r>
+      <w:proofErr w:type="spellStart"/>
+      <w:r>
+        <w:rPr>
+          <w:rFonts w:ascii="Times New Roman" w:eastAsia="Times New Roman" w:hAnsi="Times New Roman" w:cs="Times New Roman"/>
+          <w:color w:val="000000"/>
+          <w:sz w:val="28"/>
+          <w:szCs w:val="28"/>
+        </w:rPr>
+        <w:t>Android</w:t>
+      </w:r>
+      <w:proofErr w:type="spellEnd"/>
+      <w:r>
+        <w:rPr>
+          <w:rFonts w:ascii="Times New Roman" w:eastAsia="Times New Roman" w:hAnsi="Times New Roman" w:cs="Times New Roman"/>
+          <w:color w:val="000000"/>
+          <w:sz w:val="28"/>
+          <w:szCs w:val="28"/>
+        </w:rPr>
+        <w:t>. </w:t>
+      </w:r>
+      <w:proofErr w:type="spellStart"/>
+      <w:r>
+        <w:rPr>
+          <w:rFonts w:ascii="Times New Roman" w:eastAsia="Times New Roman" w:hAnsi="Times New Roman" w:cs="Times New Roman"/>
+          <w:color w:val="000000"/>
+          <w:sz w:val="28"/>
+          <w:szCs w:val="28"/>
+        </w:rPr>
+        <w:t>Go</w:t>
+      </w:r>
+      <w:proofErr w:type="spellEnd"/>
+      <w:r>
+        <w:rPr>
+          <w:rFonts w:ascii="Times New Roman" w:eastAsia="Times New Roman" w:hAnsi="Times New Roman" w:cs="Times New Roman"/>
+          <w:color w:val="000000"/>
+          <w:sz w:val="28"/>
+          <w:szCs w:val="28"/>
+        </w:rPr>
+        <w:t>-версія простіша у розгортанні, працює на будь-якій системі і зручна для навчальних та промислових застосувань, де потрібен легкий веб-доступ без встановлення додаткового програмного забезпечення.</w:t>
+      </w:r>
+      <w:bookmarkStart w:id="1" w:name="_GoBack"/>
+      <w:bookmarkEnd w:id="1"/>
     </w:p>
     <w:sectPr>
       <w:pgSz w:w="12240" w:h="15840"/>
@@ -14354,7 +14766,6 @@
   <w:style w:type="character" w:default="1" w:styleId="a0">
     <w:name w:val="Default Paragraph Font"/>
     <w:uiPriority w:val="1"/>
-    <w:semiHidden/>
     <w:unhideWhenUsed/>
   </w:style>
   <w:style w:type="table" w:default="1" w:styleId="a1">

</xml_diff>